<commit_message>
sem 1 make a poster
</commit_message>
<xml_diff>
--- a/orientation_startsemester/Make_a_poster_session_1.docx
+++ b/orientation_startsemester/Make_a_poster_session_1.docx
@@ -72,7 +72,13 @@
         <w:rPr>
           <w:lang w:val="en-US"/>
         </w:rPr>
-        <w:t xml:space="preserve">30 minutes to </w:t>
+        <w:t>45</w:t>
+      </w:r>
+      <w:r>
+        <w:rPr>
+          <w:lang w:val="en-US"/>
+        </w:rPr>
+        <w:t xml:space="preserve"> minutes to </w:t>
       </w:r>
       <w:r>
         <w:rPr>
@@ -379,7 +385,23 @@
           <w:b/>
           <w:bCs/>
         </w:rPr>
-        <w:t>Poster Creation (30 minutes)</w:t>
+        <w:t>Poster Creation (</w:t>
+      </w:r>
+      <w:r>
+        <w:rPr>
+          <w:rFonts w:ascii="Calibri" w:hAnsi="Calibri" w:cs="Calibri"/>
+          <w:b/>
+          <w:bCs/>
+        </w:rPr>
+        <w:t>45</w:t>
+      </w:r>
+      <w:r>
+        <w:rPr>
+          <w:rFonts w:ascii="Calibri" w:hAnsi="Calibri" w:cs="Calibri"/>
+          <w:b/>
+          <w:bCs/>
+        </w:rPr>
+        <w:t xml:space="preserve"> minutes)</w:t>
       </w:r>
     </w:p>
     <w:p>

</xml_diff>